<commit_message>
feat: sync updated skill trees for v1.0.8048
Include source rule changes, typo fixes, semantic corrections and new abilities.
Preserve knight/luck cleric and artificer rules, existing skill IDs and the nine complete mage transformations.
Update pages, character data, advisor indexes and platform release versions.
</commit_message>
<xml_diff>
--- a/基础职业-战舞者.docx
+++ b/基础职业-战舞者.docx
@@ -14,8 +14,6 @@
           <w:lang w:val="en-US" w:eastAsia="zh-CN"/>
         </w:rPr>
       </w:pPr>
-      <w:bookmarkStart w:id="4" w:name="_GoBack"/>
-      <w:bookmarkEnd w:id="4"/>
       <w:r>
         <w:rPr>
           <w:rFonts w:hint="eastAsia" w:ascii="楷体" w:hAnsi="楷体" w:eastAsia="楷体"/>
@@ -5187,6 +5185,12 @@
             <w:insideH w:val="single" w:color="auto" w:sz="4" w:space="0"/>
             <w:insideV w:val="single" w:color="auto" w:sz="4" w:space="0"/>
           </w:tblBorders>
+          <w:tblCellMar>
+            <w:top w:w="0" w:type="dxa"/>
+            <w:left w:w="108" w:type="dxa"/>
+            <w:bottom w:w="0" w:type="dxa"/>
+            <w:right w:w="108" w:type="dxa"/>
+          </w:tblCellMar>
         </w:tblPrEx>
         <w:tc>
           <w:tcPr>
@@ -12479,7 +12483,18 @@
                 <w:sz w:val="24"/>
                 <w:lang w:val="en-US" w:eastAsia="zh-CN"/>
               </w:rPr>
-              <w:t>跨越并</w:t>
+              <w:t>跨越火焰灼烧那些</w:t>
+            </w:r>
+            <w:bookmarkStart w:id="4" w:name="_GoBack"/>
+            <w:bookmarkEnd w:id="4"/>
+            <w:r>
+              <w:rPr>
+                <w:rFonts w:hint="eastAsia" w:ascii="楷体" w:hAnsi="楷体" w:eastAsia="楷体" w:cs="楷体"/>
+                <w:kern w:val="0"/>
+                <w:sz w:val="24"/>
+                <w:lang w:val="en-US" w:eastAsia="zh-CN"/>
+              </w:rPr>
+              <w:t>对手</w:t>
             </w:r>
           </w:p>
         </w:tc>
@@ -19426,14 +19441,6 @@
       </w:tblGrid>
       <w:tr>
         <w:tblPrEx>
-          <w:tblBorders>
-            <w:top w:val="single" w:color="auto" w:sz="4" w:space="0"/>
-            <w:left w:val="single" w:color="auto" w:sz="4" w:space="0"/>
-            <w:bottom w:val="single" w:color="auto" w:sz="4" w:space="0"/>
-            <w:right w:val="single" w:color="auto" w:sz="4" w:space="0"/>
-            <w:insideH w:val="single" w:color="auto" w:sz="4" w:space="0"/>
-            <w:insideV w:val="single" w:color="auto" w:sz="4" w:space="0"/>
-          </w:tblBorders>
           <w:tblCellMar>
             <w:top w:w="0" w:type="dxa"/>
             <w:left w:w="108" w:type="dxa"/>
@@ -25041,6 +25048,12 @@
             <w:insideH w:val="single" w:color="auto" w:sz="4" w:space="0"/>
             <w:insideV w:val="single" w:color="auto" w:sz="4" w:space="0"/>
           </w:tblBorders>
+          <w:tblCellMar>
+            <w:top w:w="0" w:type="dxa"/>
+            <w:left w:w="108" w:type="dxa"/>
+            <w:bottom w:w="0" w:type="dxa"/>
+            <w:right w:w="108" w:type="dxa"/>
+          </w:tblCellMar>
         </w:tblPrEx>
         <w:tc>
           <w:tcPr>
@@ -34520,6 +34533,12 @@
             <w:insideH w:val="single" w:color="auto" w:sz="4" w:space="0"/>
             <w:insideV w:val="single" w:color="auto" w:sz="4" w:space="0"/>
           </w:tblBorders>
+          <w:tblCellMar>
+            <w:top w:w="0" w:type="dxa"/>
+            <w:left w:w="108" w:type="dxa"/>
+            <w:bottom w:w="0" w:type="dxa"/>
+            <w:right w:w="108" w:type="dxa"/>
+          </w:tblCellMar>
         </w:tblPrEx>
         <w:tc>
           <w:tcPr>
@@ -44111,7 +44130,7 @@
                 <w:sz w:val="24"/>
                 <w:lang w:val="en-US" w:eastAsia="zh-CN"/>
               </w:rPr>
-              <w:t>如果两次攻击均为命中目标，那么你将会掷一颗D2骰来决定自身进入缴械或击倒状态</w:t>
+              <w:t>如果两次攻击均命中目标，那么你将会掷一颗D2骰来决定自身进入缴械或击倒状态</w:t>
             </w:r>
           </w:p>
           <w:p>

</xml_diff>